<commit_message>
Contract tool v0.6.7 — addendum numbering fix, battery comma fix, test harness
- mergeAddendumInto: keep OOXML numbering.xml schema order (all <w:abstractNum>
  before all <w:num>) so addendum-merged .docx no longer lose bullets / renumber
  continuously in Word.
- Battery template §4.6 comma splice fixed; addendum home → property wording.
- v0.6.6 cache-bust bump + battery template comma fix (interim).
- New test/ matrix harness: drives the real app in headless Chrome across
  contractType × addendum × cleanCopy, validates each generated .docx
  (well-formedness, numbering order, peach, highlight, addendum, battery).
  TARGET_URL env var runs it against a deployed build.
- .gitignore: ignore test harness install artifacts and battery reference doc.

Deployed to https://beta.makello-contract.pages.dev/ (beta branch).

Co-Authored-By: Claude Opus 4.8 (1M context) <noreply@anthropic.com>
</commit_message>
<xml_diff>
--- a/addendum_template.docx
+++ b/addendum_template.docx
@@ -280,7 +280,21 @@
           <w:rFonts w:ascii="Arial" w:eastAsia="Arial" w:hAnsi="Arial" w:cs="Arial"/>
           <w:color w:val="000000"/>
         </w:rPr>
-        <w:t>) the Customer’s negligence or willful misconduct, violation of law, breach of this Contract or any misrepresentation by the Customer hereunder (each a “Claim”); provided, that nothing herein shall require the Customer to indemnify any Indemnified Party to the extent a Claim results from such Indemnified Party’s own negligence or willful misconduct or (ii) the existence, uncovering or unveiling, or any release of any hazardous or toxic substance, waste or material, or any other substance, pollutant or condition that poses a risk to human health or the environment at the Customers home.  The provisions of this Section shall survive termination or expiration of this Contract.</w:t>
+        <w:t xml:space="preserve">) the Customer’s negligence or willful misconduct, violation of law, breach of this Contract or any misrepresentation by the Customer hereunder (each a “Claim”); provided, that nothing herein shall require the Customer to indemnify any Indemnified Party to the extent a Claim results from such Indemnified Party’s own negligence or willful misconduct or (ii) the existence, uncovering or unveiling, or any release of any hazardous or toxic substance, waste or material, or any other substance, pollutant or condition that poses a risk to human health or the environment at the Customers </w:t>
+      </w:r>
+      <w:r>
+        <w:rPr>
+          <w:rFonts w:ascii="Arial" w:eastAsia="Arial" w:hAnsi="Arial" w:cs="Arial"/>
+          <w:color w:val="000000"/>
+        </w:rPr>
+        <w:t>property</w:t>
+      </w:r>
+      <w:r>
+        <w:rPr>
+          <w:rFonts w:ascii="Arial" w:eastAsia="Arial" w:hAnsi="Arial" w:cs="Arial"/>
+          <w:color w:val="000000"/>
+        </w:rPr>
+        <w:t>.  The provisions of this Section shall survive termination or expiration of this Contract.</w:t>
       </w:r>
     </w:p>
     <w:p>
@@ -1509,7 +1523,21 @@
           <w:color w:val="000000"/>
         </w:rPr>
         <w:lastRenderedPageBreak/>
-        <w:t>finds the lien is valid, you could be forced to pay twice or have a court officer sell your home to pay the lien. Liens can also affect your credit.</w:t>
+        <w:t xml:space="preserve">finds the lien is valid, you could be forced to pay twice or have a court officer sell your </w:t>
+      </w:r>
+      <w:r>
+        <w:rPr>
+          <w:rFonts w:ascii="Arial" w:eastAsia="Arial" w:hAnsi="Arial" w:cs="Arial"/>
+          <w:color w:val="000000"/>
+        </w:rPr>
+        <w:t>property</w:t>
+      </w:r>
+      <w:r>
+        <w:rPr>
+          <w:rFonts w:ascii="Arial" w:eastAsia="Arial" w:hAnsi="Arial" w:cs="Arial"/>
+          <w:color w:val="000000"/>
+        </w:rPr>
+        <w:t xml:space="preserve"> to pay the lien. Liens can also affect your credit.</w:t>
       </w:r>
     </w:p>
     <w:p>

</xml_diff>